<commit_message>
add flutter code and news names in the CCT
ajouts du code de base de flutter et de 2 noms dans le cahier de charge technique
</commit_message>
<xml_diff>
--- a/documentation/CAHIER DES CHARGES TECHNIQUE DU PROJET SYNAFIG DIGITAL.docx
+++ b/documentation/CAHIER DES CHARGES TECHNIQUE DU PROJET SYNAFIG DIGITAL.docx
@@ -122,6 +122,12 @@
       <w:r>
         <w:t xml:space="preserve">, </w:t>
       </w:r>
+      <w:r>
+        <w:t xml:space="preserve">odjo emmmanuella, </w:t>
+      </w:r>
+      <w:r>
+        <w:t>Some Edgard</w:t>
+      </w:r>
     </w:p>
     <w:p>
       <w:r>
@@ -523,17 +529,8 @@
           <w:b/>
           <w:bCs/>
         </w:rPr>
-        <w:t xml:space="preserve">4. Choix technologiques pour le </w:t>
-      </w:r>
-      <w:proofErr w:type="spellStart"/>
-      <w:r>
-        <w:rPr>
-          <w:b/>
-          <w:bCs/>
-        </w:rPr>
-        <w:t>front-end</w:t>
-      </w:r>
-      <w:proofErr w:type="spellEnd"/>
+        <w:t>4. Choix technologiques pour le front-end</w:t>
+      </w:r>
     </w:p>
     <w:p>
       <w:pPr>
@@ -562,23 +559,7 @@
           <w:b/>
           <w:bCs/>
         </w:rPr>
-        <w:t>Blade (</w:t>
-      </w:r>
-      <w:proofErr w:type="spellStart"/>
-      <w:r>
-        <w:rPr>
-          <w:b/>
-          <w:bCs/>
-        </w:rPr>
-        <w:t>Laravel</w:t>
-      </w:r>
-      <w:proofErr w:type="spellEnd"/>
-      <w:r>
-        <w:rPr>
-          <w:b/>
-          <w:bCs/>
-        </w:rPr>
-        <w:t>) :</w:t>
+        <w:t>Blade (Laravel) :</w:t>
       </w:r>
       <w:r>
         <w:t xml:space="preserve"> Moteur de templating natif pour un rendu rapide côté serveur, facilitant l'intégration des vues.</w:t>
@@ -614,15 +595,7 @@
         <w:t>Flutter (Dart) :</w:t>
       </w:r>
       <w:r>
-        <w:t xml:space="preserve"> Développement multiplateforme (iOS &amp; Android) offrant des performances natives, une grande réactivité d'affichage et une gestion simplifiée de l'état avec </w:t>
-      </w:r>
-      <w:proofErr w:type="spellStart"/>
-      <w:r>
-        <w:t>flutter_bloc</w:t>
-      </w:r>
-      <w:proofErr w:type="spellEnd"/>
-      <w:r>
-        <w:t xml:space="preserve"> ou provider.</w:t>
+        <w:t xml:space="preserve"> Développement multiplateforme (iOS &amp; Android) offrant des performances natives, une grande réactivité d'affichage et une gestion simplifiée de l'état avec flutter_bloc ou provider.</w:t>
       </w:r>
     </w:p>
     <w:p/>
@@ -638,17 +611,8 @@
           <w:b/>
           <w:bCs/>
         </w:rPr>
-        <w:t xml:space="preserve">5. Choix technologiques pour le </w:t>
-      </w:r>
-      <w:proofErr w:type="spellStart"/>
-      <w:r>
-        <w:rPr>
-          <w:b/>
-          <w:bCs/>
-        </w:rPr>
-        <w:t>back-end</w:t>
-      </w:r>
-      <w:proofErr w:type="spellEnd"/>
+        <w:t>5. Choix technologiques pour le back-end</w:t>
+      </w:r>
     </w:p>
     <w:p>
       <w:pPr>
@@ -667,21 +631,12 @@
       <w:r>
         <w:t xml:space="preserve"> </w:t>
       </w:r>
-      <w:proofErr w:type="spellStart"/>
-      <w:r>
-        <w:rPr>
-          <w:b/>
-          <w:bCs/>
-        </w:rPr>
-        <w:t>Laravel</w:t>
-      </w:r>
-      <w:proofErr w:type="spellEnd"/>
-      <w:r>
-        <w:rPr>
-          <w:b/>
-          <w:bCs/>
-        </w:rPr>
-        <w:t xml:space="preserve"> (PHP)</w:t>
+      <w:r>
+        <w:rPr>
+          <w:b/>
+          <w:bCs/>
+        </w:rPr>
+        <w:t>Laravel (PHP)</w:t>
       </w:r>
     </w:p>
     <w:p>
@@ -702,21 +657,12 @@
           <w:numId w:val="5"/>
         </w:numPr>
       </w:pPr>
-      <w:proofErr w:type="spellStart"/>
-      <w:r>
-        <w:rPr>
-          <w:b/>
-          <w:bCs/>
-        </w:rPr>
-        <w:t>Laravel</w:t>
-      </w:r>
-      <w:proofErr w:type="spellEnd"/>
-      <w:r>
-        <w:rPr>
-          <w:b/>
-          <w:bCs/>
-        </w:rPr>
-        <w:t xml:space="preserve"> Breeze :</w:t>
+      <w:r>
+        <w:rPr>
+          <w:b/>
+          <w:bCs/>
+        </w:rPr>
+        <w:t>Laravel Breeze :</w:t>
       </w:r>
       <w:r>
         <w:t xml:space="preserve"> Gestion sécurisée de l'authentification web (connexion, réinitialisation de mot de passe, sessions).</w:t>
@@ -729,51 +675,24 @@
           <w:numId w:val="5"/>
         </w:numPr>
       </w:pPr>
-      <w:proofErr w:type="spellStart"/>
       <w:r>
         <w:rPr>
           <w:b/>
           <w:bCs/>
         </w:rPr>
         <w:lastRenderedPageBreak/>
-        <w:t>Laravel</w:t>
-      </w:r>
-      <w:proofErr w:type="spellEnd"/>
-      <w:r>
-        <w:rPr>
-          <w:b/>
-          <w:bCs/>
-        </w:rPr>
-        <w:t xml:space="preserve"> Sanctum :</w:t>
+        <w:t>Laravel Sanctum :</w:t>
       </w:r>
       <w:r>
         <w:t xml:space="preserve"> Génération et validation des jetons de sécurité (</w:t>
       </w:r>
-      <w:proofErr w:type="spellStart"/>
       <w:r>
         <w:rPr>
           <w:i/>
           <w:iCs/>
         </w:rPr>
-        <w:t>Personal</w:t>
-      </w:r>
-      <w:proofErr w:type="spellEnd"/>
-      <w:r>
-        <w:rPr>
-          <w:i/>
-          <w:iCs/>
-        </w:rPr>
-        <w:t xml:space="preserve"> Access </w:t>
-      </w:r>
-      <w:proofErr w:type="spellStart"/>
-      <w:r>
-        <w:rPr>
-          <w:i/>
-          <w:iCs/>
-        </w:rPr>
-        <w:t>Tokens</w:t>
-      </w:r>
-      <w:proofErr w:type="spellEnd"/>
+        <w:t>Personal Access Tokens</w:t>
+      </w:r>
       <w:r>
         <w:t>) pour l'application Flutter.</w:t>
       </w:r>
@@ -800,23 +719,7 @@
           <w:b/>
           <w:bCs/>
         </w:rPr>
-        <w:t xml:space="preserve">MySQL (Moteur </w:t>
-      </w:r>
-      <w:proofErr w:type="spellStart"/>
-      <w:r>
-        <w:rPr>
-          <w:b/>
-          <w:bCs/>
-        </w:rPr>
-        <w:t>InnoDB</w:t>
-      </w:r>
-      <w:proofErr w:type="spellEnd"/>
-      <w:r>
-        <w:rPr>
-          <w:b/>
-          <w:bCs/>
-        </w:rPr>
-        <w:t>)</w:t>
+        <w:t>MySQL (Moteur InnoDB)</w:t>
       </w:r>
     </w:p>
     <w:p>
@@ -873,61 +776,103 @@
       </w:r>
     </w:p>
     <w:p>
-      <w:proofErr w:type="spellStart"/>
       <w:r>
         <w:t>Plaintext</w:t>
       </w:r>
-      <w:proofErr w:type="spellEnd"/>
-    </w:p>
-    <w:p>
-      <w:r>
-        <w:t xml:space="preserve">[ Application Mobile Flutter ]  &lt;-- (API REST / HTTPS JSON) --&gt;  [ Backend </w:t>
-      </w:r>
-      <w:proofErr w:type="spellStart"/>
-      <w:r>
-        <w:t>Laravel</w:t>
-      </w:r>
-      <w:proofErr w:type="spellEnd"/>
-      <w:r>
-        <w:t xml:space="preserve"> ] &lt;--&gt; [ MySQL </w:t>
-      </w:r>
-      <w:proofErr w:type="spellStart"/>
-      <w:r>
-        <w:t>Database</w:t>
-      </w:r>
-      <w:proofErr w:type="spellEnd"/>
-      <w:r>
-        <w:t xml:space="preserve"> ]</w:t>
-      </w:r>
-    </w:p>
-    <w:p>
-      <w:r>
-        <w:t xml:space="preserve">[  Portail Web Admin Blade   ]  &lt;-- (SSR / Blade </w:t>
-      </w:r>
-      <w:proofErr w:type="spellStart"/>
-      <w:r>
-        <w:t>Templates</w:t>
-      </w:r>
-      <w:proofErr w:type="spellEnd"/>
-      <w:r>
-        <w:t xml:space="preserve">)  --&gt;  [ Backend </w:t>
-      </w:r>
-      <w:proofErr w:type="spellStart"/>
-      <w:r>
-        <w:t>Laravel</w:t>
-      </w:r>
-      <w:proofErr w:type="spellEnd"/>
-      <w:r>
-        <w:t xml:space="preserve"> ] &lt;--&gt; [ MySQL </w:t>
-      </w:r>
-      <w:proofErr w:type="spellStart"/>
-      <w:r>
-        <w:t>Database</w:t>
-      </w:r>
-      <w:proofErr w:type="spellEnd"/>
-      <w:r>
-        <w:t xml:space="preserve"> ]</w:t>
-      </w:r>
+    </w:p>
+    <w:p>
+      <w:proofErr w:type="gramStart"/>
+      <w:r>
+        <w:t>[ Application</w:t>
+      </w:r>
+      <w:proofErr w:type="gramEnd"/>
+      <w:r>
+        <w:t xml:space="preserve"> Mobile </w:t>
+      </w:r>
+      <w:proofErr w:type="gramStart"/>
+      <w:r>
+        <w:t>Flutter ]</w:t>
+      </w:r>
+      <w:proofErr w:type="gramEnd"/>
+      <w:r>
+        <w:t xml:space="preserve">  &lt;-- (API REST / HTTPS JSON) --</w:t>
+      </w:r>
+      <w:proofErr w:type="gramStart"/>
+      <w:r>
+        <w:t>&gt;  [</w:t>
+      </w:r>
+      <w:proofErr w:type="gramEnd"/>
+      <w:r>
+        <w:t xml:space="preserve"> Backend </w:t>
+      </w:r>
+      <w:proofErr w:type="gramStart"/>
+      <w:r>
+        <w:t>Laravel ]</w:t>
+      </w:r>
+      <w:proofErr w:type="gramEnd"/>
+      <w:r>
+        <w:t xml:space="preserve"> &lt;--&gt; </w:t>
+      </w:r>
+      <w:proofErr w:type="gramStart"/>
+      <w:r>
+        <w:t>[ MySQL</w:t>
+      </w:r>
+      <w:proofErr w:type="gramEnd"/>
+      <w:r>
+        <w:t xml:space="preserve"> </w:t>
+      </w:r>
+      <w:proofErr w:type="gramStart"/>
+      <w:r>
+        <w:t>Database ]</w:t>
+      </w:r>
+      <w:proofErr w:type="gramEnd"/>
+    </w:p>
+    <w:p>
+      <w:proofErr w:type="gramStart"/>
+      <w:r>
+        <w:t>[  Portail</w:t>
+      </w:r>
+      <w:proofErr w:type="gramEnd"/>
+      <w:r>
+        <w:t xml:space="preserve"> Web Admin Blade </w:t>
+      </w:r>
+      <w:proofErr w:type="gramStart"/>
+      <w:r>
+        <w:t xml:space="preserve">  ]</w:t>
+      </w:r>
+      <w:proofErr w:type="gramEnd"/>
+      <w:r>
+        <w:t xml:space="preserve">  &lt;-- (SSR / Blade </w:t>
+      </w:r>
+      <w:proofErr w:type="gramStart"/>
+      <w:r>
+        <w:t>Templates)  --&gt;  [</w:t>
+      </w:r>
+      <w:proofErr w:type="gramEnd"/>
+      <w:r>
+        <w:t xml:space="preserve"> Backend </w:t>
+      </w:r>
+      <w:proofErr w:type="gramStart"/>
+      <w:r>
+        <w:t>Laravel ]</w:t>
+      </w:r>
+      <w:proofErr w:type="gramEnd"/>
+      <w:r>
+        <w:t xml:space="preserve"> &lt;--&gt; </w:t>
+      </w:r>
+      <w:proofErr w:type="gramStart"/>
+      <w:r>
+        <w:t>[ MySQL</w:t>
+      </w:r>
+      <w:proofErr w:type="gramEnd"/>
+      <w:r>
+        <w:t xml:space="preserve"> </w:t>
+      </w:r>
+      <w:proofErr w:type="gramStart"/>
+      <w:r>
+        <w:t>Database ]</w:t>
+      </w:r>
+      <w:proofErr w:type="gramEnd"/>
     </w:p>
     <w:p>
       <w:pPr>
@@ -962,15 +907,7 @@
         <w:t>Couche Service / API :</w:t>
       </w:r>
       <w:r>
-        <w:t xml:space="preserve"> Contrôleurs </w:t>
-      </w:r>
-      <w:proofErr w:type="spellStart"/>
-      <w:r>
-        <w:t>Laravel</w:t>
-      </w:r>
-      <w:proofErr w:type="spellEnd"/>
-      <w:r>
-        <w:t xml:space="preserve"> traitant les requêtes, appliquant la logique métier et renvoyant du JSON (pour l'API) ou des vues HTML (pour le web).</w:t>
+        <w:t xml:space="preserve"> Contrôleurs Laravel traitant les requêtes, appliquant la logique métier et renvoyant du JSON (pour l'API) ou des vues HTML (pour le web).</w:t>
       </w:r>
     </w:p>
     <w:p>
@@ -1013,21 +950,12 @@
           <w:numId w:val="6"/>
         </w:numPr>
       </w:pPr>
-      <w:proofErr w:type="spellStart"/>
-      <w:r>
-        <w:rPr>
-          <w:b/>
-          <w:bCs/>
-        </w:rPr>
-        <w:t>Firebase</w:t>
-      </w:r>
-      <w:proofErr w:type="spellEnd"/>
-      <w:r>
-        <w:rPr>
-          <w:b/>
-          <w:bCs/>
-        </w:rPr>
-        <w:t xml:space="preserve"> Cloud Messaging (FCM) :</w:t>
+      <w:r>
+        <w:rPr>
+          <w:b/>
+          <w:bCs/>
+        </w:rPr>
+        <w:t>Firebase Cloud Messaging (FCM) :</w:t>
       </w:r>
       <w:r>
         <w:t xml:space="preserve"> Pour l'envoi de notifications push ciblées.</w:t>
@@ -1083,7 +1011,6 @@
       <w:r>
         <w:t xml:space="preserve"> HTTPS/TLS sur l'ensemble des échanges Web et Mobile. Hachage fort des mots de passe via l'algorithme </w:t>
       </w:r>
-      <w:proofErr w:type="spellStart"/>
       <w:r>
         <w:rPr>
           <w:b/>
@@ -1091,7 +1018,6 @@
         </w:rPr>
         <w:t>Bcrypt</w:t>
       </w:r>
-      <w:proofErr w:type="spellEnd"/>
       <w:r>
         <w:t>.</w:t>
       </w:r>
@@ -1130,15 +1056,7 @@
         </w:numPr>
       </w:pPr>
       <w:r>
-        <w:t xml:space="preserve">Failles CSRF contrecarrées par les jetons CSRF natifs de </w:t>
-      </w:r>
-      <w:proofErr w:type="spellStart"/>
-      <w:r>
-        <w:t>Laravel</w:t>
-      </w:r>
-      <w:proofErr w:type="spellEnd"/>
-      <w:r>
-        <w:t>.</w:t>
+        <w:t>Failles CSRF contrecarrées par les jetons CSRF natifs de Laravel.</w:t>
       </w:r>
     </w:p>
     <w:p>
@@ -1168,23 +1086,7 @@
         <w:t>Gestion fine des permissions :</w:t>
       </w:r>
       <w:r>
-        <w:t xml:space="preserve"> Attribution de rôles stricts via </w:t>
-      </w:r>
-      <w:proofErr w:type="spellStart"/>
-      <w:r>
-        <w:t>spatie</w:t>
-      </w:r>
-      <w:proofErr w:type="spellEnd"/>
-      <w:r>
-        <w:t>/</w:t>
-      </w:r>
-      <w:proofErr w:type="spellStart"/>
-      <w:r>
-        <w:t>laravel</w:t>
-      </w:r>
-      <w:proofErr w:type="spellEnd"/>
-      <w:r>
-        <w:t>-permission (ADHERENT, DELEGUE_REGIONAL, ADMIN_BUREAU, SUPER_ADMIN).</w:t>
+        <w:t xml:space="preserve"> Attribution de rôles stricts via spatie/laravel-permission (ADHERENT, DELEGUE_REGIONAL, ADMIN_BUREAU, SUPER_ADMIN).</w:t>
       </w:r>
     </w:p>
     <w:p/>
@@ -1215,23 +1117,7 @@
           <w:b/>
           <w:bCs/>
         </w:rPr>
-        <w:t xml:space="preserve">Environnement de </w:t>
-      </w:r>
-      <w:proofErr w:type="spellStart"/>
-      <w:r>
-        <w:rPr>
-          <w:b/>
-          <w:bCs/>
-        </w:rPr>
-        <w:t>Pré-production</w:t>
-      </w:r>
-      <w:proofErr w:type="spellEnd"/>
-      <w:r>
-        <w:rPr>
-          <w:b/>
-          <w:bCs/>
-        </w:rPr>
-        <w:t xml:space="preserve"> :</w:t>
+        <w:t>Environnement de Pré-production :</w:t>
       </w:r>
       <w:r>
         <w:t xml:space="preserve"> Serveur VPS Linux (Ubuntu 24.04 LTS) configuré avec Nginx, PHP-FPM et MySQL.</w:t>
@@ -1270,15 +1156,7 @@
         <w:t>Mobile :</w:t>
       </w:r>
       <w:r>
-        <w:t xml:space="preserve"> Génération des livrables .</w:t>
-      </w:r>
-      <w:proofErr w:type="spellStart"/>
-      <w:r>
-        <w:t>apk</w:t>
-      </w:r>
-      <w:proofErr w:type="spellEnd"/>
-      <w:r>
-        <w:t xml:space="preserve"> (Android) et déploiement sur Google Play Store &amp; Apple App Store.</w:t>
+        <w:t xml:space="preserve"> Génération des livrables .apk (Android) et déploiement sur Google Play Store &amp; Apple App Store.</w:t>
       </w:r>
     </w:p>
     <w:p/>
@@ -1320,47 +1198,7 @@
         </w:numPr>
       </w:pPr>
       <w:r>
-        <w:t xml:space="preserve">PHP &gt;= 8.2 (extensions : </w:t>
-      </w:r>
-      <w:proofErr w:type="spellStart"/>
-      <w:r>
-        <w:t>mbstring</w:t>
-      </w:r>
-      <w:proofErr w:type="spellEnd"/>
-      <w:r>
-        <w:t xml:space="preserve">, </w:t>
-      </w:r>
-      <w:proofErr w:type="spellStart"/>
-      <w:r>
-        <w:t>pdo</w:t>
-      </w:r>
-      <w:proofErr w:type="spellEnd"/>
-      <w:r>
-        <w:t xml:space="preserve">, </w:t>
-      </w:r>
-      <w:proofErr w:type="spellStart"/>
-      <w:r>
-        <w:t>pdo_mysql</w:t>
-      </w:r>
-      <w:proofErr w:type="spellEnd"/>
-      <w:r>
-        <w:t xml:space="preserve">, </w:t>
-      </w:r>
-      <w:proofErr w:type="spellStart"/>
-      <w:r>
-        <w:t>openssl</w:t>
-      </w:r>
-      <w:proofErr w:type="spellEnd"/>
-      <w:r>
-        <w:t xml:space="preserve">, </w:t>
-      </w:r>
-      <w:proofErr w:type="spellStart"/>
-      <w:r>
-        <w:t>tokenizer</w:t>
-      </w:r>
-      <w:proofErr w:type="spellEnd"/>
-      <w:r>
-        <w:t>, xml)</w:t>
+        <w:t>PHP &gt;= 8.2 (extensions : mbstring, pdo, pdo_mysql, openssl, tokenizer, xml)</w:t>
       </w:r>
     </w:p>
     <w:p>
@@ -1434,15 +1272,7 @@
         <w:t xml:space="preserve"> </w:t>
       </w:r>
       <w:r>
-        <w:t xml:space="preserve">pour plus de rapidité nous utiliserons </w:t>
-      </w:r>
-      <w:proofErr w:type="spellStart"/>
-      <w:r>
-        <w:t>github</w:t>
-      </w:r>
-      <w:proofErr w:type="spellEnd"/>
-      <w:r>
-        <w:t xml:space="preserve"> desktop</w:t>
+        <w:t>pour plus de rapidité nous utiliserons github desktop</w:t>
       </w:r>
     </w:p>
     <w:p>
@@ -1461,29 +1291,24 @@
       </w:r>
     </w:p>
     <w:p>
-      <w:r>
-        <w:t xml:space="preserve">composer </w:t>
-      </w:r>
-      <w:proofErr w:type="spellStart"/>
-      <w:r>
-        <w:t>install</w:t>
-      </w:r>
-      <w:proofErr w:type="spellEnd"/>
-    </w:p>
-    <w:p>
-      <w:proofErr w:type="spellStart"/>
+      <w:proofErr w:type="gramStart"/>
+      <w:r>
+        <w:t>composer</w:t>
+      </w:r>
+      <w:proofErr w:type="gramEnd"/>
+      <w:r>
+        <w:t xml:space="preserve"> install</w:t>
+      </w:r>
+    </w:p>
+    <w:p>
+      <w:proofErr w:type="gramStart"/>
       <w:r>
         <w:t>npm</w:t>
       </w:r>
-      <w:proofErr w:type="spellEnd"/>
-      <w:r>
-        <w:t xml:space="preserve"> </w:t>
-      </w:r>
-      <w:proofErr w:type="spellStart"/>
-      <w:r>
-        <w:t>install</w:t>
-      </w:r>
-      <w:proofErr w:type="spellEnd"/>
+      <w:proofErr w:type="gramEnd"/>
+      <w:r>
+        <w:t xml:space="preserve"> install</w:t>
+      </w:r>
     </w:p>
     <w:p>
       <w:pPr>
@@ -1501,42 +1326,34 @@
       </w:r>
     </w:p>
     <w:p>
-      <w:proofErr w:type="spellStart"/>
-      <w:r>
-        <w:t>cp</w:t>
-      </w:r>
-      <w:proofErr w:type="spellEnd"/>
-      <w:r>
-        <w:t xml:space="preserve"> .</w:t>
-      </w:r>
-      <w:proofErr w:type="spellStart"/>
-      <w:r>
-        <w:t>env.example</w:t>
-      </w:r>
-      <w:proofErr w:type="spellEnd"/>
-      <w:r>
-        <w:t xml:space="preserve"> .</w:t>
-      </w:r>
-      <w:proofErr w:type="spellStart"/>
-      <w:r>
-        <w:t>env</w:t>
-      </w:r>
-      <w:proofErr w:type="spellEnd"/>
-    </w:p>
-    <w:p>
-      <w:proofErr w:type="spellStart"/>
+      <w:proofErr w:type="gramStart"/>
+      <w:r>
+        <w:t>cp .env</w:t>
+      </w:r>
+      <w:proofErr w:type="gramEnd"/>
+      <w:r>
+        <w:t>.</w:t>
+      </w:r>
+      <w:proofErr w:type="gramStart"/>
+      <w:r>
+        <w:t>example .env</w:t>
+      </w:r>
+      <w:proofErr w:type="gramEnd"/>
+    </w:p>
+    <w:p>
+      <w:proofErr w:type="gramStart"/>
       <w:r>
         <w:t>php</w:t>
       </w:r>
-      <w:proofErr w:type="spellEnd"/>
+      <w:proofErr w:type="gramEnd"/>
       <w:r>
         <w:t xml:space="preserve"> artisan </w:t>
       </w:r>
-      <w:proofErr w:type="spellStart"/>
+      <w:proofErr w:type="gramStart"/>
       <w:r>
         <w:t>key:generate</w:t>
       </w:r>
-      <w:proofErr w:type="spellEnd"/>
+      <w:proofErr w:type="gramEnd"/>
     </w:p>
     <w:p>
       <w:r>
@@ -1574,10 +1391,22 @@
           <w:i/>
           <w:iCs/>
         </w:rPr>
-        <w:t xml:space="preserve">) dans le fichier </w:t>
-      </w:r>
-      <w:r>
-        <w:t>.env</w:t>
+        <w:t xml:space="preserve">) dans le </w:t>
+      </w:r>
+      <w:proofErr w:type="gramStart"/>
+      <w:r>
+        <w:rPr>
+          <w:i/>
+          <w:iCs/>
+        </w:rPr>
+        <w:t xml:space="preserve">fichier </w:t>
+      </w:r>
+      <w:r>
+        <w:t>.</w:t>
+      </w:r>
+      <w:proofErr w:type="gramEnd"/>
+      <w:r>
+        <w:t>env</w:t>
       </w:r>
       <w:r>
         <w:rPr>
@@ -1604,43 +1433,25 @@
       </w:r>
     </w:p>
     <w:p>
-      <w:proofErr w:type="spellStart"/>
+      <w:proofErr w:type="gramStart"/>
       <w:r>
         <w:lastRenderedPageBreak/>
         <w:t>php</w:t>
       </w:r>
-      <w:proofErr w:type="spellEnd"/>
-      <w:r>
-        <w:t xml:space="preserve"> artisan </w:t>
-      </w:r>
-      <w:proofErr w:type="spellStart"/>
-      <w:r>
-        <w:t>migrate</w:t>
-      </w:r>
-      <w:proofErr w:type="spellEnd"/>
-      <w:r>
-        <w:t xml:space="preserve"> --</w:t>
-      </w:r>
-      <w:proofErr w:type="spellStart"/>
-      <w:r>
-        <w:t>seed</w:t>
-      </w:r>
-      <w:proofErr w:type="spellEnd"/>
-    </w:p>
-    <w:p>
-      <w:proofErr w:type="spellStart"/>
+      <w:proofErr w:type="gramEnd"/>
+      <w:r>
+        <w:t xml:space="preserve"> artisan migrate --seed</w:t>
+      </w:r>
+    </w:p>
+    <w:p>
+      <w:proofErr w:type="gramStart"/>
       <w:r>
         <w:t>npm</w:t>
       </w:r>
-      <w:proofErr w:type="spellEnd"/>
-      <w:r>
-        <w:t xml:space="preserve"> run </w:t>
-      </w:r>
-      <w:proofErr w:type="spellStart"/>
-      <w:r>
-        <w:t>build</w:t>
-      </w:r>
-      <w:proofErr w:type="spellEnd"/>
+      <w:proofErr w:type="gramEnd"/>
+      <w:r>
+        <w:t xml:space="preserve"> run build</w:t>
+      </w:r>
     </w:p>
     <w:p/>
     <w:p>
@@ -1659,11 +1470,11 @@
       </w:r>
     </w:p>
     <w:p>
-      <w:proofErr w:type="spellStart"/>
+      <w:proofErr w:type="gramStart"/>
       <w:r>
         <w:t>php</w:t>
       </w:r>
-      <w:proofErr w:type="spellEnd"/>
+      <w:proofErr w:type="gramEnd"/>
       <w:r>
         <w:t xml:space="preserve"> artisan serve</w:t>
       </w:r>
@@ -1714,15 +1525,7 @@
         <w:t>Sprint 1 :</w:t>
       </w:r>
       <w:r>
-        <w:t xml:space="preserve"> Modélisation de la BDD, configuration </w:t>
-      </w:r>
-      <w:proofErr w:type="spellStart"/>
-      <w:r>
-        <w:t>Laravel</w:t>
-      </w:r>
-      <w:proofErr w:type="spellEnd"/>
-      <w:r>
-        <w:t>/Breeze/Sanctum et maquettage UI/UX.</w:t>
+        <w:t xml:space="preserve"> Modélisation de la BDD, configuration Laravel/Breeze/Sanctum et maquettage UI/UX.</w:t>
       </w:r>
     </w:p>
     <w:p>
@@ -1900,15 +1703,7 @@
         <w:t>Maquettage &amp; Design :</w:t>
       </w:r>
       <w:r>
-        <w:t xml:space="preserve"> </w:t>
-      </w:r>
-      <w:proofErr w:type="spellStart"/>
-      <w:r>
-        <w:t>Figma</w:t>
-      </w:r>
-      <w:proofErr w:type="spellEnd"/>
-      <w:r>
-        <w:t>.</w:t>
+        <w:t xml:space="preserve"> Figma.</w:t>
       </w:r>
     </w:p>
     <w:p/>
@@ -2010,23 +1805,7 @@
                 <w:bCs/>
               </w:rPr>
               <w:lastRenderedPageBreak/>
-              <w:t>Backend (</w:t>
-            </w:r>
-            <w:proofErr w:type="spellStart"/>
-            <w:r>
-              <w:rPr>
-                <w:b/>
-                <w:bCs/>
-              </w:rPr>
-              <w:t>Laravel</w:t>
-            </w:r>
-            <w:proofErr w:type="spellEnd"/>
-            <w:r>
-              <w:rPr>
-                <w:b/>
-                <w:bCs/>
-              </w:rPr>
-              <w:t>)</w:t>
+              <w:t>Backend (Laravel)</w:t>
             </w:r>
           </w:p>
         </w:tc>
@@ -2322,7 +2101,6 @@
             <w:pPr>
               <w:spacing w:after="160" w:line="278" w:lineRule="auto"/>
             </w:pPr>
-            <w:proofErr w:type="spellStart"/>
             <w:r>
               <w:rPr>
                 <w:b/>
@@ -2330,7 +2108,6 @@
               </w:rPr>
               <w:t>Front-End</w:t>
             </w:r>
-            <w:proofErr w:type="spellEnd"/>
           </w:p>
         </w:tc>
         <w:tc>
@@ -2342,7 +2119,6 @@
             <w:pPr>
               <w:spacing w:after="160" w:line="278" w:lineRule="auto"/>
             </w:pPr>
-            <w:proofErr w:type="spellStart"/>
             <w:r>
               <w:rPr>
                 <w:b/>
@@ -2350,7 +2126,6 @@
               </w:rPr>
               <w:t>Back-End</w:t>
             </w:r>
-            <w:proofErr w:type="spellEnd"/>
           </w:p>
         </w:tc>
       </w:tr>
@@ -2397,31 +2172,7 @@
               <w:spacing w:after="160" w:line="278" w:lineRule="auto"/>
             </w:pPr>
             <w:r>
-              <w:t xml:space="preserve">Contrôleurs </w:t>
-            </w:r>
-            <w:proofErr w:type="spellStart"/>
-            <w:r>
-              <w:t>Laravel</w:t>
-            </w:r>
-            <w:proofErr w:type="spellEnd"/>
-            <w:r>
-              <w:t xml:space="preserve">, génération de </w:t>
-            </w:r>
-            <w:proofErr w:type="spellStart"/>
-            <w:r>
-              <w:t>Tokens</w:t>
-            </w:r>
-            <w:proofErr w:type="spellEnd"/>
-            <w:r>
-              <w:t xml:space="preserve"> Sanctum, hachage </w:t>
-            </w:r>
-            <w:proofErr w:type="spellStart"/>
-            <w:r>
-              <w:t>Bcrypt</w:t>
-            </w:r>
-            <w:proofErr w:type="spellEnd"/>
-            <w:r>
-              <w:t>.</w:t>
+              <w:t>Contrôleurs Laravel, génération de Tokens Sanctum, hachage Bcrypt.</w:t>
             </w:r>
           </w:p>
         </w:tc>
@@ -2516,13 +2267,8 @@
             <w:pPr>
               <w:spacing w:after="160" w:line="278" w:lineRule="auto"/>
             </w:pPr>
-            <w:proofErr w:type="spellStart"/>
             <w:r>
-              <w:t>Webhook</w:t>
-            </w:r>
-            <w:proofErr w:type="spellEnd"/>
-            <w:r>
-              <w:t xml:space="preserve"> de confirmation de paiement, enregistrement transactionnel MySQL.</w:t>
+              <w:t>Webhook de confirmation de paiement, enregistrement transactionnel MySQL.</w:t>
             </w:r>
           </w:p>
         </w:tc>
@@ -2666,15 +2412,7 @@
               <w:spacing w:after="160" w:line="278" w:lineRule="auto"/>
             </w:pPr>
             <w:r>
-              <w:t xml:space="preserve">Intégration du SDK </w:t>
-            </w:r>
-            <w:proofErr w:type="spellStart"/>
-            <w:r>
-              <w:t>Firebase</w:t>
-            </w:r>
-            <w:proofErr w:type="spellEnd"/>
-            <w:r>
-              <w:t xml:space="preserve"> pour le déclenchement des envois groupés.</w:t>
+              <w:t>Intégration du SDK Firebase pour le déclenchement des envois groupés.</w:t>
             </w:r>
           </w:p>
         </w:tc>
@@ -2790,15 +2528,7 @@
               <w:spacing w:after="160" w:line="278" w:lineRule="auto"/>
             </w:pPr>
             <w:r>
-              <w:t xml:space="preserve">Inscription d'un nouvel adhérent avec </w:t>
-            </w:r>
-            <w:proofErr w:type="spellStart"/>
-            <w:r>
-              <w:t>upload</w:t>
-            </w:r>
-            <w:proofErr w:type="spellEnd"/>
-            <w:r>
-              <w:t xml:space="preserve"> de justificatif</w:t>
+              <w:t>Inscription d'un nouvel adhérent avec upload de justificatif</w:t>
             </w:r>
           </w:p>
         </w:tc>
@@ -2852,15 +2582,7 @@
               <w:spacing w:after="160" w:line="278" w:lineRule="auto"/>
             </w:pPr>
             <w:r>
-              <w:t>Paiement d'une cotisation via Mobile Money (</w:t>
-            </w:r>
-            <w:proofErr w:type="spellStart"/>
-            <w:r>
-              <w:t>Sandbox</w:t>
-            </w:r>
-            <w:proofErr w:type="spellEnd"/>
-            <w:r>
-              <w:t>)</w:t>
+              <w:t>Paiement d'une cotisation via Mobile Money (Sandbox)</w:t>
             </w:r>
           </w:p>
         </w:tc>
@@ -2976,11 +2698,11 @@
           <w:numId w:val="13"/>
         </w:numPr>
       </w:pPr>
-      <w:proofErr w:type="spellStart"/>
+      <w:proofErr w:type="gramStart"/>
       <w:r>
         <w:t>users</w:t>
       </w:r>
-      <w:proofErr w:type="spellEnd"/>
+      <w:proofErr w:type="gramEnd"/>
       <w:r>
         <w:rPr>
           <w:b/>
@@ -3009,11 +2731,11 @@
           <w:numId w:val="13"/>
         </w:numPr>
       </w:pPr>
-      <w:proofErr w:type="spellStart"/>
+      <w:proofErr w:type="gramStart"/>
       <w:r>
         <w:t>users</w:t>
       </w:r>
-      <w:proofErr w:type="spellEnd"/>
+      <w:proofErr w:type="gramEnd"/>
       <w:r>
         <w:rPr>
           <w:b/>
@@ -3042,11 +2764,11 @@
           <w:numId w:val="13"/>
         </w:numPr>
       </w:pPr>
-      <w:proofErr w:type="spellStart"/>
+      <w:proofErr w:type="gramStart"/>
       <w:r>
         <w:t>users</w:t>
       </w:r>
-      <w:proofErr w:type="spellEnd"/>
+      <w:proofErr w:type="gramEnd"/>
       <w:r>
         <w:rPr>
           <w:b/>
@@ -3054,11 +2776,9 @@
         </w:rPr>
         <w:t xml:space="preserve"> (1) ---&gt; (N) </w:t>
       </w:r>
-      <w:proofErr w:type="spellStart"/>
       <w:r>
         <w:t>actualites</w:t>
       </w:r>
-      <w:proofErr w:type="spellEnd"/>
       <w:r>
         <w:rPr>
           <w:b/>
@@ -3078,349 +2798,188 @@
     </w:p>
     <w:p>
       <w:r>
-        <w:t xml:space="preserve">CREATE DATABASE IF NOT EXISTS </w:t>
-      </w:r>
-      <w:proofErr w:type="spellStart"/>
-      <w:r>
-        <w:t>synafig_db</w:t>
-      </w:r>
-      <w:proofErr w:type="spellEnd"/>
-      <w:r>
-        <w:t xml:space="preserve"> CHARACTER SET utf8mb4 COLLATE utf8mb4_unicode_ci;</w:t>
-      </w:r>
-    </w:p>
-    <w:p>
-      <w:r>
-        <w:t xml:space="preserve">USE </w:t>
-      </w:r>
-      <w:proofErr w:type="spellStart"/>
-      <w:r>
-        <w:t>synafig_db</w:t>
-      </w:r>
-      <w:proofErr w:type="spellEnd"/>
-      <w:r>
-        <w:t>;</w:t>
-      </w:r>
+        <w:t>CREATE DATABASE IF NOT EXISTS synafig_db CHARACTER SET utf8mb4 COLLATE utf8mb4_unicode_</w:t>
+      </w:r>
+      <w:proofErr w:type="gramStart"/>
+      <w:r>
+        <w:t>ci;</w:t>
+      </w:r>
+      <w:proofErr w:type="gramEnd"/>
+    </w:p>
+    <w:p>
+      <w:r>
+        <w:t>USE synafig_</w:t>
+      </w:r>
+      <w:proofErr w:type="gramStart"/>
+      <w:r>
+        <w:t>db;</w:t>
+      </w:r>
+      <w:proofErr w:type="gramEnd"/>
     </w:p>
     <w:p/>
     <w:p>
       <w:r>
-        <w:t xml:space="preserve">CREATE TABLE </w:t>
-      </w:r>
-      <w:proofErr w:type="spellStart"/>
-      <w:r>
-        <w:t>users</w:t>
-      </w:r>
-      <w:proofErr w:type="spellEnd"/>
-      <w:r>
-        <w:t xml:space="preserve"> (</w:t>
-      </w:r>
-    </w:p>
-    <w:p>
-      <w:r>
-        <w:t xml:space="preserve">    id BIGINT UNSIGNED AUTO_INCREMENT PRIMARY KEY,</w:t>
-      </w:r>
-    </w:p>
-    <w:p>
-      <w:r>
-        <w:t xml:space="preserve">    matricule VARCHAR(50) UNIQUE NOT NULL,</w:t>
-      </w:r>
-    </w:p>
-    <w:p>
-      <w:r>
-        <w:t xml:space="preserve">    nom VARCHAR(100) NOT NULL,</w:t>
+        <w:t>CREATE TABLE users (</w:t>
       </w:r>
     </w:p>
     <w:p>
       <w:r>
         <w:t xml:space="preserve">    </w:t>
       </w:r>
-      <w:proofErr w:type="spellStart"/>
+      <w:proofErr w:type="gramStart"/>
+      <w:r>
+        <w:t>id</w:t>
+      </w:r>
+      <w:proofErr w:type="gramEnd"/>
+      <w:r>
+        <w:t xml:space="preserve"> BIGINT UNSIGNED AUTO_INCREMENT PRIMARY KEY,</w:t>
+      </w:r>
+    </w:p>
+    <w:p>
+      <w:r>
+        <w:t xml:space="preserve">    </w:t>
+      </w:r>
+      <w:proofErr w:type="gramStart"/>
+      <w:r>
+        <w:t>matricule</w:t>
+      </w:r>
+      <w:proofErr w:type="gramEnd"/>
+      <w:r>
+        <w:t xml:space="preserve"> </w:t>
+      </w:r>
+      <w:proofErr w:type="gramStart"/>
+      <w:r>
+        <w:t>VARCHAR(</w:t>
+      </w:r>
+      <w:proofErr w:type="gramEnd"/>
+      <w:r>
+        <w:t>50) UNIQUE NOT NULL,</w:t>
+      </w:r>
+    </w:p>
+    <w:p>
+      <w:r>
+        <w:t xml:space="preserve">    </w:t>
+      </w:r>
+      <w:proofErr w:type="gramStart"/>
+      <w:r>
+        <w:t>nom</w:t>
+      </w:r>
+      <w:proofErr w:type="gramEnd"/>
+      <w:r>
+        <w:t xml:space="preserve"> </w:t>
+      </w:r>
+      <w:proofErr w:type="gramStart"/>
+      <w:r>
+        <w:t>VARCHAR(</w:t>
+      </w:r>
+      <w:proofErr w:type="gramEnd"/>
+      <w:r>
+        <w:t>100) NOT NULL,</w:t>
+      </w:r>
+    </w:p>
+    <w:p>
+      <w:r>
+        <w:t xml:space="preserve">    </w:t>
+      </w:r>
+      <w:proofErr w:type="gramStart"/>
       <w:r>
         <w:t>prenom</w:t>
       </w:r>
-      <w:proofErr w:type="spellEnd"/>
-      <w:r>
-        <w:t xml:space="preserve"> VARCHAR(100) NOT NULL,</w:t>
-      </w:r>
-    </w:p>
-    <w:p>
-      <w:r>
-        <w:t xml:space="preserve">    email VARCHAR(150) UNIQUE NOT NULL,</w:t>
+      <w:proofErr w:type="gramEnd"/>
+      <w:r>
+        <w:t xml:space="preserve"> </w:t>
+      </w:r>
+      <w:proofErr w:type="gramStart"/>
+      <w:r>
+        <w:t>VARCHAR(</w:t>
+      </w:r>
+      <w:proofErr w:type="gramEnd"/>
+      <w:r>
+        <w:t>100) NOT NULL,</w:t>
       </w:r>
     </w:p>
     <w:p>
       <w:r>
         <w:t xml:space="preserve">    </w:t>
       </w:r>
-      <w:proofErr w:type="spellStart"/>
+      <w:proofErr w:type="gramStart"/>
+      <w:r>
+        <w:t>email</w:t>
+      </w:r>
+      <w:proofErr w:type="gramEnd"/>
+      <w:r>
+        <w:t xml:space="preserve"> </w:t>
+      </w:r>
+      <w:proofErr w:type="gramStart"/>
+      <w:r>
+        <w:t>VARCHAR(</w:t>
+      </w:r>
+      <w:proofErr w:type="gramEnd"/>
+      <w:r>
+        <w:t>150) UNIQUE NOT NULL,</w:t>
+      </w:r>
+    </w:p>
+    <w:p>
+      <w:r>
+        <w:t xml:space="preserve">    </w:t>
+      </w:r>
+      <w:proofErr w:type="gramStart"/>
       <w:r>
         <w:t>telephone</w:t>
       </w:r>
-      <w:proofErr w:type="spellEnd"/>
-      <w:r>
-        <w:t xml:space="preserve"> VARCHAR(20) NOT NULL,</w:t>
+      <w:proofErr w:type="gramEnd"/>
+      <w:r>
+        <w:t xml:space="preserve"> </w:t>
+      </w:r>
+      <w:proofErr w:type="gramStart"/>
+      <w:r>
+        <w:t>VARCHAR(</w:t>
+      </w:r>
+      <w:proofErr w:type="gramEnd"/>
+      <w:r>
+        <w:t>20) NOT NULL,</w:t>
       </w:r>
     </w:p>
     <w:p>
       <w:r>
         <w:t xml:space="preserve">    </w:t>
       </w:r>
-      <w:proofErr w:type="spellStart"/>
+      <w:proofErr w:type="gramStart"/>
       <w:r>
         <w:t>password</w:t>
       </w:r>
-      <w:proofErr w:type="spellEnd"/>
-      <w:r>
-        <w:t xml:space="preserve"> VARCHAR(255) NOT NULL,</w:t>
-      </w:r>
-    </w:p>
-    <w:p>
-      <w:r>
-        <w:t xml:space="preserve">    grade VARCHAR(100) NULL,</w:t>
-      </w:r>
-    </w:p>
-    <w:p>
-      <w:r>
-        <w:lastRenderedPageBreak/>
-        <w:t xml:space="preserve">    direction VARCHAR(150) NULL,</w:t>
+      <w:proofErr w:type="gramEnd"/>
+      <w:r>
+        <w:t xml:space="preserve"> </w:t>
+      </w:r>
+      <w:proofErr w:type="gramStart"/>
+      <w:r>
+        <w:t>VARCHAR(</w:t>
+      </w:r>
+      <w:proofErr w:type="gramEnd"/>
+      <w:r>
+        <w:t>255) NOT NULL,</w:t>
       </w:r>
     </w:p>
     <w:p>
       <w:r>
         <w:t xml:space="preserve">    </w:t>
       </w:r>
-      <w:proofErr w:type="spellStart"/>
-      <w:r>
-        <w:t>region_administrative</w:t>
-      </w:r>
-      <w:proofErr w:type="spellEnd"/>
-      <w:r>
-        <w:t xml:space="preserve"> VARCHAR(100) NULL,</w:t>
-      </w:r>
-    </w:p>
-    <w:p>
-      <w:r>
-        <w:t xml:space="preserve">    </w:t>
-      </w:r>
-      <w:proofErr w:type="spellStart"/>
-      <w:r>
-        <w:t>role</w:t>
-      </w:r>
-      <w:proofErr w:type="spellEnd"/>
-      <w:r>
-        <w:t xml:space="preserve"> ENUM('ADHERENT', 'DELEGUE', 'ADMIN') DEFAULT 'ADHERENT',</w:t>
-      </w:r>
-    </w:p>
-    <w:p>
-      <w:r>
-        <w:t xml:space="preserve">    </w:t>
-      </w:r>
-      <w:proofErr w:type="spellStart"/>
-      <w:r>
-        <w:t>statut_adhesion</w:t>
-      </w:r>
-      <w:proofErr w:type="spellEnd"/>
-      <w:r>
-        <w:t xml:space="preserve"> ENUM('EN_ATTENTE', 'VALIDE', 'SUSPENDU', 'REJETE') DEFAULT 'EN_ATTENTE',</w:t>
-      </w:r>
-    </w:p>
-    <w:p>
-      <w:r>
-        <w:t xml:space="preserve">    </w:t>
-      </w:r>
-      <w:proofErr w:type="spellStart"/>
-      <w:r>
-        <w:t>created_at</w:t>
-      </w:r>
-      <w:proofErr w:type="spellEnd"/>
-      <w:r>
-        <w:t xml:space="preserve"> TIMESTAMP DEFAULT CURRENT_TIMESTAMP,</w:t>
-      </w:r>
-    </w:p>
-    <w:p>
-      <w:r>
-        <w:t xml:space="preserve">    </w:t>
-      </w:r>
-      <w:proofErr w:type="spellStart"/>
-      <w:r>
-        <w:t>updated_at</w:t>
-      </w:r>
-      <w:proofErr w:type="spellEnd"/>
-      <w:r>
-        <w:t xml:space="preserve"> TIMESTAMP DEFAULT CURRENT_TIMESTAMP ON UPDATE CURRENT_TIMESTAMP</w:t>
-      </w:r>
-    </w:p>
-    <w:p>
-      <w:r>
-        <w:t>) ENGINE=</w:t>
-      </w:r>
-      <w:proofErr w:type="spellStart"/>
-      <w:r>
-        <w:t>InnoDB</w:t>
-      </w:r>
-      <w:proofErr w:type="spellEnd"/>
-      <w:r>
-        <w:t>;</w:t>
-      </w:r>
-    </w:p>
-    <w:p/>
-    <w:p>
-      <w:r>
-        <w:t>CREATE TABLE cotisations (</w:t>
-      </w:r>
-    </w:p>
-    <w:p>
-      <w:r>
-        <w:t xml:space="preserve">    id BIGINT UNSIGNED AUTO_INCREMENT PRIMARY KEY,</w:t>
-      </w:r>
-    </w:p>
-    <w:p>
-      <w:r>
-        <w:t xml:space="preserve">    </w:t>
-      </w:r>
-      <w:proofErr w:type="spellStart"/>
-      <w:r>
-        <w:t>user_id</w:t>
-      </w:r>
-      <w:proofErr w:type="spellEnd"/>
-      <w:r>
-        <w:t xml:space="preserve"> BIGINT UNSIGNED NOT NULL,</w:t>
-      </w:r>
-    </w:p>
-    <w:p>
-      <w:r>
-        <w:t xml:space="preserve">    montant DECIMAL(10, 2) NOT NULL,</w:t>
-      </w:r>
-    </w:p>
-    <w:p>
-      <w:r>
-        <w:t xml:space="preserve">    mois INT NOT NULL,</w:t>
-      </w:r>
-    </w:p>
-    <w:p>
-      <w:r>
-        <w:t xml:space="preserve">    </w:t>
-      </w:r>
-      <w:proofErr w:type="spellStart"/>
-      <w:r>
-        <w:t>annee</w:t>
-      </w:r>
-      <w:proofErr w:type="spellEnd"/>
-      <w:r>
-        <w:t xml:space="preserve"> INT NOT NULL,</w:t>
-      </w:r>
-    </w:p>
-    <w:p>
-      <w:r>
-        <w:t xml:space="preserve">    </w:t>
-      </w:r>
-      <w:proofErr w:type="spellStart"/>
-      <w:r>
-        <w:t>moyen_paiement</w:t>
-      </w:r>
-      <w:proofErr w:type="spellEnd"/>
-      <w:r>
-        <w:t xml:space="preserve"> ENUM('WAVE', 'ORANGE_MONEY', 'MTN_MOMO', 'MOOV_MONEY') NOT NULL,</w:t>
-      </w:r>
-    </w:p>
-    <w:p>
-      <w:r>
-        <w:t xml:space="preserve">    </w:t>
-      </w:r>
-      <w:proofErr w:type="spellStart"/>
-      <w:r>
-        <w:t>reference_transaction</w:t>
-      </w:r>
-      <w:proofErr w:type="spellEnd"/>
-      <w:r>
-        <w:t xml:space="preserve"> VARCHAR(100) UNIQUE NOT NULL,</w:t>
-      </w:r>
-    </w:p>
-    <w:p>
-      <w:r>
-        <w:t xml:space="preserve">    statut ENUM('EN_ATTENTE', 'SUCCES', 'ECHEC') DEFAULT 'EN_ATTENTE',</w:t>
-      </w:r>
-    </w:p>
-    <w:p>
-      <w:r>
-        <w:t xml:space="preserve">    </w:t>
-      </w:r>
-      <w:proofErr w:type="spellStart"/>
-      <w:r>
-        <w:t>created_at</w:t>
-      </w:r>
-      <w:proofErr w:type="spellEnd"/>
-      <w:r>
-        <w:t xml:space="preserve"> TIMESTAMP DEFAULT CURRENT_TIMESTAMP,</w:t>
-      </w:r>
-    </w:p>
-    <w:p>
-      <w:r>
-        <w:t xml:space="preserve">    FOREIGN KEY (</w:t>
-      </w:r>
-      <w:proofErr w:type="spellStart"/>
-      <w:r>
-        <w:t>user_id</w:t>
-      </w:r>
-      <w:proofErr w:type="spellEnd"/>
-      <w:r>
-        <w:t xml:space="preserve">) REFERENCES </w:t>
-      </w:r>
-      <w:proofErr w:type="spellStart"/>
-      <w:r>
-        <w:t>users</w:t>
-      </w:r>
-      <w:proofErr w:type="spellEnd"/>
-      <w:r>
-        <w:t>(id) ON DELETE CASCADE</w:t>
-      </w:r>
-    </w:p>
-    <w:p>
-      <w:r>
-        <w:t>) ENGINE=</w:t>
-      </w:r>
-      <w:proofErr w:type="spellStart"/>
-      <w:r>
-        <w:t>InnoDB</w:t>
-      </w:r>
-      <w:proofErr w:type="spellEnd"/>
-      <w:r>
-        <w:t>;</w:t>
-      </w:r>
-    </w:p>
-    <w:p/>
-    <w:p>
-      <w:r>
-        <w:t xml:space="preserve">CREATE TABLE </w:t>
-      </w:r>
-      <w:proofErr w:type="spellStart"/>
-      <w:r>
-        <w:t>actualites</w:t>
-      </w:r>
-      <w:proofErr w:type="spellEnd"/>
-      <w:r>
-        <w:t xml:space="preserve"> (</w:t>
-      </w:r>
-    </w:p>
-    <w:p>
-      <w:r>
-        <w:t xml:space="preserve">    id BIGINT UNSIGNED AUTO_INCREMENT PRIMARY KEY,</w:t>
-      </w:r>
-    </w:p>
-    <w:p>
-      <w:r>
-        <w:t xml:space="preserve">    titre VARCHAR(255) NOT NULL,</w:t>
-      </w:r>
-    </w:p>
-    <w:p>
-      <w:r>
-        <w:t xml:space="preserve">    slug VARCHAR(255) UNIQUE NOT NULL,</w:t>
-      </w:r>
-    </w:p>
-    <w:p>
-      <w:r>
-        <w:t xml:space="preserve">    contenu TEXT NOT NULL,</w:t>
+      <w:proofErr w:type="gramStart"/>
+      <w:r>
+        <w:t>grade</w:t>
+      </w:r>
+      <w:proofErr w:type="gramEnd"/>
+      <w:r>
+        <w:t xml:space="preserve"> </w:t>
+      </w:r>
+      <w:proofErr w:type="gramStart"/>
+      <w:r>
+        <w:t>VARCHAR(</w:t>
+      </w:r>
+      <w:proofErr w:type="gramEnd"/>
+      <w:r>
+        <w:t>100) NULL,</w:t>
       </w:r>
     </w:p>
     <w:p>
@@ -3428,139 +2987,546 @@
         <w:lastRenderedPageBreak/>
         <w:t xml:space="preserve">    </w:t>
       </w:r>
-      <w:proofErr w:type="spellStart"/>
-      <w:r>
-        <w:t>image_url</w:t>
-      </w:r>
-      <w:proofErr w:type="spellEnd"/>
-      <w:r>
-        <w:t xml:space="preserve"> VARCHAR(255) NULL,</w:t>
+      <w:proofErr w:type="gramStart"/>
+      <w:r>
+        <w:t>direction</w:t>
+      </w:r>
+      <w:proofErr w:type="gramEnd"/>
+      <w:r>
+        <w:t xml:space="preserve"> </w:t>
+      </w:r>
+      <w:proofErr w:type="gramStart"/>
+      <w:r>
+        <w:t>VARCHAR(</w:t>
+      </w:r>
+      <w:proofErr w:type="gramEnd"/>
+      <w:r>
+        <w:t>150) NULL,</w:t>
       </w:r>
     </w:p>
     <w:p>
       <w:r>
         <w:t xml:space="preserve">    </w:t>
       </w:r>
-      <w:proofErr w:type="spellStart"/>
-      <w:r>
-        <w:t>created_at</w:t>
-      </w:r>
-      <w:proofErr w:type="spellEnd"/>
-      <w:r>
-        <w:t xml:space="preserve"> TIMESTAMP DEFAULT CURRENT_TIMESTAMP</w:t>
+      <w:proofErr w:type="gramStart"/>
+      <w:r>
+        <w:t>region</w:t>
+      </w:r>
+      <w:proofErr w:type="gramEnd"/>
+      <w:r>
+        <w:t xml:space="preserve">_administrative </w:t>
+      </w:r>
+      <w:proofErr w:type="gramStart"/>
+      <w:r>
+        <w:t>VARCHAR(</w:t>
+      </w:r>
+      <w:proofErr w:type="gramEnd"/>
+      <w:r>
+        <w:t>100) NULL,</w:t>
+      </w:r>
+    </w:p>
+    <w:p>
+      <w:r>
+        <w:t xml:space="preserve">    </w:t>
+      </w:r>
+      <w:proofErr w:type="gramStart"/>
+      <w:r>
+        <w:t>role</w:t>
+      </w:r>
+      <w:proofErr w:type="gramEnd"/>
+      <w:r>
+        <w:t xml:space="preserve"> </w:t>
+      </w:r>
+      <w:proofErr w:type="gramStart"/>
+      <w:r>
+        <w:t>ENUM(</w:t>
+      </w:r>
+      <w:proofErr w:type="gramEnd"/>
+      <w:r>
+        <w:t>'ADHERENT', 'DELEGUE', 'ADMIN') DEFAULT 'ADHERENT',</w:t>
+      </w:r>
+    </w:p>
+    <w:p>
+      <w:r>
+        <w:t xml:space="preserve">    </w:t>
+      </w:r>
+      <w:proofErr w:type="gramStart"/>
+      <w:r>
+        <w:t>statut</w:t>
+      </w:r>
+      <w:proofErr w:type="gramEnd"/>
+      <w:r>
+        <w:t xml:space="preserve">_adhesion </w:t>
+      </w:r>
+      <w:proofErr w:type="gramStart"/>
+      <w:r>
+        <w:t>ENUM(</w:t>
+      </w:r>
+      <w:proofErr w:type="gramEnd"/>
+      <w:r>
+        <w:t>'EN_ATTENTE', 'VALIDE', 'SUSPENDU', 'REJETE') DEFAULT 'EN_ATTENTE',</w:t>
+      </w:r>
+    </w:p>
+    <w:p>
+      <w:r>
+        <w:t xml:space="preserve">    </w:t>
+      </w:r>
+      <w:proofErr w:type="gramStart"/>
+      <w:r>
+        <w:t>created</w:t>
+      </w:r>
+      <w:proofErr w:type="gramEnd"/>
+      <w:r>
+        <w:t>_at TIMESTAMP DEFAULT CURRENT_TIMESTAMP,</w:t>
+      </w:r>
+    </w:p>
+    <w:p>
+      <w:r>
+        <w:t xml:space="preserve">    </w:t>
+      </w:r>
+      <w:proofErr w:type="gramStart"/>
+      <w:r>
+        <w:t>updated</w:t>
+      </w:r>
+      <w:proofErr w:type="gramEnd"/>
+      <w:r>
+        <w:t>_at TIMESTAMP DEFAULT CURRENT_TIMESTAMP ON UPDATE CURRENT_TIMESTAMP</w:t>
       </w:r>
     </w:p>
     <w:p>
       <w:r>
         <w:t>) ENGINE=</w:t>
       </w:r>
-      <w:proofErr w:type="spellStart"/>
-      <w:r>
-        <w:t>InnoDB</w:t>
-      </w:r>
-      <w:proofErr w:type="spellEnd"/>
-      <w:r>
-        <w:t>;</w:t>
-      </w:r>
+      <w:proofErr w:type="gramStart"/>
+      <w:r>
+        <w:t>InnoDB;</w:t>
+      </w:r>
+      <w:proofErr w:type="gramEnd"/>
     </w:p>
     <w:p/>
     <w:p>
       <w:r>
+        <w:t>CREATE TABLE cotisations (</w:t>
+      </w:r>
+    </w:p>
+    <w:p>
+      <w:r>
+        <w:t xml:space="preserve">    </w:t>
+      </w:r>
+      <w:proofErr w:type="gramStart"/>
+      <w:r>
+        <w:t>id</w:t>
+      </w:r>
+      <w:proofErr w:type="gramEnd"/>
+      <w:r>
+        <w:t xml:space="preserve"> BIGINT UNSIGNED AUTO_INCREMENT PRIMARY KEY,</w:t>
+      </w:r>
+    </w:p>
+    <w:p>
+      <w:r>
+        <w:t xml:space="preserve">    </w:t>
+      </w:r>
+      <w:proofErr w:type="gramStart"/>
+      <w:r>
+        <w:t>user</w:t>
+      </w:r>
+      <w:proofErr w:type="gramEnd"/>
+      <w:r>
+        <w:t>_id BIGINT UNSIGNED NOT NULL,</w:t>
+      </w:r>
+    </w:p>
+    <w:p>
+      <w:r>
+        <w:t xml:space="preserve">    </w:t>
+      </w:r>
+      <w:proofErr w:type="gramStart"/>
+      <w:r>
+        <w:t>montant</w:t>
+      </w:r>
+      <w:proofErr w:type="gramEnd"/>
+      <w:r>
+        <w:t xml:space="preserve"> </w:t>
+      </w:r>
+      <w:proofErr w:type="gramStart"/>
+      <w:r>
+        <w:t>DECIMAL(</w:t>
+      </w:r>
+      <w:proofErr w:type="gramEnd"/>
+      <w:r>
+        <w:t>10, 2) NOT NULL,</w:t>
+      </w:r>
+    </w:p>
+    <w:p>
+      <w:r>
+        <w:t xml:space="preserve">    </w:t>
+      </w:r>
+      <w:proofErr w:type="gramStart"/>
+      <w:r>
+        <w:t>mois</w:t>
+      </w:r>
+      <w:proofErr w:type="gramEnd"/>
+      <w:r>
+        <w:t xml:space="preserve"> INT NOT NULL,</w:t>
+      </w:r>
+    </w:p>
+    <w:p>
+      <w:r>
+        <w:t xml:space="preserve">    </w:t>
+      </w:r>
+      <w:proofErr w:type="gramStart"/>
+      <w:r>
+        <w:t>annee</w:t>
+      </w:r>
+      <w:proofErr w:type="gramEnd"/>
+      <w:r>
+        <w:t xml:space="preserve"> INT NOT NULL,</w:t>
+      </w:r>
+    </w:p>
+    <w:p>
+      <w:r>
+        <w:t xml:space="preserve">    </w:t>
+      </w:r>
+      <w:proofErr w:type="gramStart"/>
+      <w:r>
+        <w:t>moyen</w:t>
+      </w:r>
+      <w:proofErr w:type="gramEnd"/>
+      <w:r>
+        <w:t xml:space="preserve">_paiement </w:t>
+      </w:r>
+      <w:proofErr w:type="gramStart"/>
+      <w:r>
+        <w:t>ENUM(</w:t>
+      </w:r>
+      <w:proofErr w:type="gramEnd"/>
+      <w:r>
+        <w:t>'WAVE', 'ORANGE_MONEY', 'MTN_MOMO', 'MOOV_MONEY') NOT NULL,</w:t>
+      </w:r>
+    </w:p>
+    <w:p>
+      <w:r>
+        <w:t xml:space="preserve">    </w:t>
+      </w:r>
+      <w:proofErr w:type="gramStart"/>
+      <w:r>
+        <w:t>reference</w:t>
+      </w:r>
+      <w:proofErr w:type="gramEnd"/>
+      <w:r>
+        <w:t xml:space="preserve">_transaction </w:t>
+      </w:r>
+      <w:proofErr w:type="gramStart"/>
+      <w:r>
+        <w:t>VARCHAR(</w:t>
+      </w:r>
+      <w:proofErr w:type="gramEnd"/>
+      <w:r>
+        <w:t>100) UNIQUE NOT NULL,</w:t>
+      </w:r>
+    </w:p>
+    <w:p>
+      <w:r>
+        <w:t xml:space="preserve">    </w:t>
+      </w:r>
+      <w:proofErr w:type="gramStart"/>
+      <w:r>
+        <w:t>statut</w:t>
+      </w:r>
+      <w:proofErr w:type="gramEnd"/>
+      <w:r>
+        <w:t xml:space="preserve"> </w:t>
+      </w:r>
+      <w:proofErr w:type="gramStart"/>
+      <w:r>
+        <w:t>ENUM(</w:t>
+      </w:r>
+      <w:proofErr w:type="gramEnd"/>
+      <w:r>
+        <w:t>'EN_ATTENTE', 'SUCCES', 'ECHEC') DEFAULT 'EN_ATTENTE',</w:t>
+      </w:r>
+    </w:p>
+    <w:p>
+      <w:r>
+        <w:t xml:space="preserve">    </w:t>
+      </w:r>
+      <w:proofErr w:type="gramStart"/>
+      <w:r>
+        <w:t>created</w:t>
+      </w:r>
+      <w:proofErr w:type="gramEnd"/>
+      <w:r>
+        <w:t>_at TIMESTAMP DEFAULT CURRENT_TIMESTAMP,</w:t>
+      </w:r>
+    </w:p>
+    <w:p>
+      <w:r>
+        <w:t xml:space="preserve">    FOREIGN KEY (user_id) REFERENCES users(id) ON DELETE CASCADE</w:t>
+      </w:r>
+    </w:p>
+    <w:p>
+      <w:r>
+        <w:t>) ENGINE=</w:t>
+      </w:r>
+      <w:proofErr w:type="gramStart"/>
+      <w:r>
+        <w:t>InnoDB;</w:t>
+      </w:r>
+      <w:proofErr w:type="gramEnd"/>
+    </w:p>
+    <w:p/>
+    <w:p>
+      <w:r>
+        <w:t>CREATE TABLE actualites (</w:t>
+      </w:r>
+    </w:p>
+    <w:p>
+      <w:r>
+        <w:t xml:space="preserve">    </w:t>
+      </w:r>
+      <w:proofErr w:type="gramStart"/>
+      <w:r>
+        <w:t>id</w:t>
+      </w:r>
+      <w:proofErr w:type="gramEnd"/>
+      <w:r>
+        <w:t xml:space="preserve"> BIGINT UNSIGNED AUTO_INCREMENT PRIMARY KEY,</w:t>
+      </w:r>
+    </w:p>
+    <w:p>
+      <w:r>
+        <w:t xml:space="preserve">    </w:t>
+      </w:r>
+      <w:proofErr w:type="gramStart"/>
+      <w:r>
+        <w:t>titre</w:t>
+      </w:r>
+      <w:proofErr w:type="gramEnd"/>
+      <w:r>
+        <w:t xml:space="preserve"> </w:t>
+      </w:r>
+      <w:proofErr w:type="gramStart"/>
+      <w:r>
+        <w:t>VARCHAR(</w:t>
+      </w:r>
+      <w:proofErr w:type="gramEnd"/>
+      <w:r>
+        <w:t>255) NOT NULL,</w:t>
+      </w:r>
+    </w:p>
+    <w:p>
+      <w:r>
+        <w:t xml:space="preserve">    </w:t>
+      </w:r>
+      <w:proofErr w:type="gramStart"/>
+      <w:r>
+        <w:t>slug</w:t>
+      </w:r>
+      <w:proofErr w:type="gramEnd"/>
+      <w:r>
+        <w:t xml:space="preserve"> </w:t>
+      </w:r>
+      <w:proofErr w:type="gramStart"/>
+      <w:r>
+        <w:t>VARCHAR(</w:t>
+      </w:r>
+      <w:proofErr w:type="gramEnd"/>
+      <w:r>
+        <w:t>255) UNIQUE NOT NULL,</w:t>
+      </w:r>
+    </w:p>
+    <w:p>
+      <w:r>
+        <w:t xml:space="preserve">    </w:t>
+      </w:r>
+      <w:proofErr w:type="gramStart"/>
+      <w:r>
+        <w:t>contenu</w:t>
+      </w:r>
+      <w:proofErr w:type="gramEnd"/>
+      <w:r>
+        <w:t xml:space="preserve"> TEXT NOT NULL,</w:t>
+      </w:r>
+    </w:p>
+    <w:p>
+      <w:r>
+        <w:lastRenderedPageBreak/>
+        <w:t xml:space="preserve">    </w:t>
+      </w:r>
+      <w:proofErr w:type="gramStart"/>
+      <w:r>
+        <w:t>image</w:t>
+      </w:r>
+      <w:proofErr w:type="gramEnd"/>
+      <w:r>
+        <w:t xml:space="preserve">_url </w:t>
+      </w:r>
+      <w:proofErr w:type="gramStart"/>
+      <w:r>
+        <w:t>VARCHAR(</w:t>
+      </w:r>
+      <w:proofErr w:type="gramEnd"/>
+      <w:r>
+        <w:t>255) NULL,</w:t>
+      </w:r>
+    </w:p>
+    <w:p>
+      <w:r>
+        <w:t xml:space="preserve">    </w:t>
+      </w:r>
+      <w:proofErr w:type="gramStart"/>
+      <w:r>
+        <w:t>created</w:t>
+      </w:r>
+      <w:proofErr w:type="gramEnd"/>
+      <w:r>
+        <w:t>_at TIMESTAMP DEFAULT CURRENT_TIMESTAMP</w:t>
+      </w:r>
+    </w:p>
+    <w:p>
+      <w:r>
+        <w:t>) ENGINE=</w:t>
+      </w:r>
+      <w:proofErr w:type="gramStart"/>
+      <w:r>
+        <w:t>InnoDB;</w:t>
+      </w:r>
+      <w:proofErr w:type="gramEnd"/>
+    </w:p>
+    <w:p/>
+    <w:p>
+      <w:r>
         <w:t>CREATE TABLE tickets (</w:t>
       </w:r>
     </w:p>
     <w:p>
       <w:r>
-        <w:t xml:space="preserve">    id BIGINT UNSIGNED AUTO_INCREMENT PRIMARY KEY,</w:t>
-      </w:r>
-    </w:p>
-    <w:p>
-      <w:r>
         <w:t xml:space="preserve">    </w:t>
       </w:r>
-      <w:proofErr w:type="spellStart"/>
-      <w:r>
-        <w:t>user_id</w:t>
-      </w:r>
-      <w:proofErr w:type="spellEnd"/>
-      <w:r>
-        <w:t xml:space="preserve"> BIGINT UNSIGNED NOT NULL,</w:t>
-      </w:r>
-    </w:p>
-    <w:p>
-      <w:r>
-        <w:t xml:space="preserve">    sujet VARCHAR(200) NOT NULL,</w:t>
-      </w:r>
-    </w:p>
-    <w:p>
-      <w:r>
-        <w:t xml:space="preserve">    description TEXT NOT NULL,</w:t>
+      <w:proofErr w:type="gramStart"/>
+      <w:r>
+        <w:t>id</w:t>
+      </w:r>
+      <w:proofErr w:type="gramEnd"/>
+      <w:r>
+        <w:t xml:space="preserve"> BIGINT UNSIGNED AUTO_INCREMENT PRIMARY KEY,</w:t>
       </w:r>
     </w:p>
     <w:p>
       <w:r>
         <w:t xml:space="preserve">    </w:t>
       </w:r>
-      <w:proofErr w:type="spellStart"/>
+      <w:proofErr w:type="gramStart"/>
+      <w:r>
+        <w:t>user</w:t>
+      </w:r>
+      <w:proofErr w:type="gramEnd"/>
+      <w:r>
+        <w:t>_id BIGINT UNSIGNED NOT NULL,</w:t>
+      </w:r>
+    </w:p>
+    <w:p>
+      <w:r>
+        <w:t xml:space="preserve">    </w:t>
+      </w:r>
+      <w:proofErr w:type="gramStart"/>
+      <w:r>
+        <w:t>sujet</w:t>
+      </w:r>
+      <w:proofErr w:type="gramEnd"/>
+      <w:r>
+        <w:t xml:space="preserve"> </w:t>
+      </w:r>
+      <w:proofErr w:type="gramStart"/>
+      <w:r>
+        <w:t>VARCHAR(</w:t>
+      </w:r>
+      <w:proofErr w:type="gramEnd"/>
+      <w:r>
+        <w:t>200) NOT NULL,</w:t>
+      </w:r>
+    </w:p>
+    <w:p>
+      <w:r>
+        <w:t xml:space="preserve">    </w:t>
+      </w:r>
+      <w:proofErr w:type="gramStart"/>
+      <w:r>
+        <w:t>description</w:t>
+      </w:r>
+      <w:proofErr w:type="gramEnd"/>
+      <w:r>
+        <w:t xml:space="preserve"> TEXT NOT NULL,</w:t>
+      </w:r>
+    </w:p>
+    <w:p>
+      <w:r>
+        <w:t xml:space="preserve">    </w:t>
+      </w:r>
+      <w:proofErr w:type="gramStart"/>
       <w:r>
         <w:t>priorite</w:t>
       </w:r>
-      <w:proofErr w:type="spellEnd"/>
-      <w:r>
-        <w:t xml:space="preserve"> ENUM('BASSE', 'MOYENNE', 'HAUTE') DEFAULT 'MOYENNE',</w:t>
-      </w:r>
-    </w:p>
-    <w:p>
-      <w:r>
-        <w:t xml:space="preserve">    statut ENUM('OUVERT', 'EN_COURS', 'RESOLU') DEFAULT 'OUVERT',</w:t>
+      <w:proofErr w:type="gramEnd"/>
+      <w:r>
+        <w:t xml:space="preserve"> </w:t>
+      </w:r>
+      <w:proofErr w:type="gramStart"/>
+      <w:r>
+        <w:t>ENUM(</w:t>
+      </w:r>
+      <w:proofErr w:type="gramEnd"/>
+      <w:r>
+        <w:t>'BASSE', 'MOYENNE', 'HAUTE') DEFAULT 'MOYENNE',</w:t>
       </w:r>
     </w:p>
     <w:p>
       <w:r>
         <w:t xml:space="preserve">    </w:t>
       </w:r>
-      <w:proofErr w:type="spellStart"/>
-      <w:r>
-        <w:t>created_at</w:t>
-      </w:r>
-      <w:proofErr w:type="spellEnd"/>
-      <w:r>
-        <w:t xml:space="preserve"> TIMESTAMP DEFAULT CURRENT_TIMESTAMP,</w:t>
-      </w:r>
-    </w:p>
-    <w:p>
-      <w:r>
-        <w:t xml:space="preserve">    FOREIGN KEY (</w:t>
-      </w:r>
-      <w:proofErr w:type="spellStart"/>
-      <w:r>
-        <w:t>user_id</w:t>
-      </w:r>
-      <w:proofErr w:type="spellEnd"/>
-      <w:r>
-        <w:t xml:space="preserve">) REFERENCES </w:t>
-      </w:r>
-      <w:proofErr w:type="spellStart"/>
-      <w:r>
-        <w:t>users</w:t>
-      </w:r>
-      <w:proofErr w:type="spellEnd"/>
-      <w:r>
-        <w:t>(id) ON DELETE CASCADE</w:t>
+      <w:proofErr w:type="gramStart"/>
+      <w:r>
+        <w:t>statut</w:t>
+      </w:r>
+      <w:proofErr w:type="gramEnd"/>
+      <w:r>
+        <w:t xml:space="preserve"> </w:t>
+      </w:r>
+      <w:proofErr w:type="gramStart"/>
+      <w:r>
+        <w:t>ENUM(</w:t>
+      </w:r>
+      <w:proofErr w:type="gramEnd"/>
+      <w:r>
+        <w:t>'OUVERT', 'EN_COURS', 'RESOLU') DEFAULT 'OUVERT',</w:t>
+      </w:r>
+    </w:p>
+    <w:p>
+      <w:r>
+        <w:t xml:space="preserve">    </w:t>
+      </w:r>
+      <w:proofErr w:type="gramStart"/>
+      <w:r>
+        <w:t>created</w:t>
+      </w:r>
+      <w:proofErr w:type="gramEnd"/>
+      <w:r>
+        <w:t>_at TIMESTAMP DEFAULT CURRENT_TIMESTAMP,</w:t>
+      </w:r>
+    </w:p>
+    <w:p>
+      <w:r>
+        <w:t xml:space="preserve">    FOREIGN KEY (user_id) REFERENCES users(id) ON DELETE CASCADE</w:t>
       </w:r>
     </w:p>
     <w:p>
       <w:r>
         <w:t>) ENGINE=</w:t>
       </w:r>
-      <w:proofErr w:type="spellStart"/>
-      <w:r>
-        <w:t>InnoDB</w:t>
-      </w:r>
-      <w:proofErr w:type="spellEnd"/>
-      <w:r>
-        <w:t>;</w:t>
-      </w:r>
+      <w:proofErr w:type="gramStart"/>
+      <w:r>
+        <w:t>InnoDB;</w:t>
+      </w:r>
+      <w:proofErr w:type="gramEnd"/>
     </w:p>
     <w:p/>
     <w:p>
@@ -3655,15 +3621,7 @@
         <w:t>Carte Membre :</w:t>
       </w:r>
       <w:r>
-        <w:t xml:space="preserve"> Vue épurée contenant la photo, le nom, le matricule et le QR code </w:t>
-      </w:r>
-      <w:proofErr w:type="spellStart"/>
-      <w:r>
-        <w:t>scannable</w:t>
-      </w:r>
-      <w:proofErr w:type="spellEnd"/>
-      <w:r>
-        <w:t>.</w:t>
+        <w:t xml:space="preserve"> Vue épurée contenant la photo, le nom, le matricule et le QR code scannable.</w:t>
       </w:r>
     </w:p>
     <w:p/>

</xml_diff>